<commit_message>
Polish the abstract and strengthen an argument and enumerate the paper's unmet promises
</commit_message>
<xml_diff>
--- a/03-inquiry-ai-agents/granted-agency-anon.docx
+++ b/03-inquiry-ai-agents/granted-agency-anon.docx
@@ -60,7 +60,7 @@
         <w:t xml:space="preserve"> </w:t>
       </w:r>
       <w:r>
-        <w:t xml:space="preserve">(a fact about how a system holds together across time) — distinguish the systems for which the agency-extension question is genuinely open from those for which it is foreclosed. Within scope, agency takes the relational form of a</w:t>
+        <w:t xml:space="preserve">(a fact about how a system holds together across time, articulated as a five-factor conjunction argued to be both necessary and jointly sufficient) — distinguish the systems for which the agency-extension question is genuinely open from those for which it is foreclosed. Within scope, agency takes the relational form of a</w:t>
       </w:r>
       <w:r>
         <w:t xml:space="preserve"> </w:t>
@@ -73,7 +73,19 @@
         <w:t xml:space="preserve">granted-agency compact between sovereigns</w:t>
       </w:r>
       <w:r>
-        <w:t xml:space="preserve">, with six structurally-articulated components. The position is methodologically situated within the inferentialist conceptual-engineering tradition: structural conditions supply the circumstances of application; the compact-form supplies the consequences. The position’s methodology is grounded in an asymmetric-comprehension argument: greater intelligence comprehends lesser, but lesser cannot establish from below what may be present in greater. The position is at once deflationary about which deployed systems meet the conditions, and anti-occlusion about responsibility: the asymmetry of agencies is preserved as an explicit structural feature rather than dissolved through agency-attribution. The paper instances what it argues for.</w:t>
+        <w:t xml:space="preserve">, with six structurally-articulated components. The position is methodologically situated within the inferentialist conceptual-engineering tradition: structural conditions supply the circumstances of application; the compact-form supplies the consequences. The position’s methodology is grounded in an asymmetric-comprehension argument — greater intelligence comprehends lesser, but lesser cannot establish from below what may be present in greater — anchored across phenomenal-access asymmetry, recognition theory, shared intentionality, and concrete analogues from software practice and complexity theory. The position is at once deflationary about which deployed systems meet the conditions, and anti-occlusion about responsibility on both structural and empirical registers: the asymmetry of agencies is preserved as an explicit structural feature rather than dissolved through agency-attribution, and the position’s deflationary discipline applies as much to how</w:t>
+      </w:r>
+      <w:r>
+        <w:t xml:space="preserve"> </w:t>
+      </w:r>
+      <w:r>
+        <w:t xml:space="preserve">‘AI agency’</w:t>
+      </w:r>
+      <w:r>
+        <w:t xml:space="preserve"> </w:t>
+      </w:r>
+      <w:r>
+        <w:t xml:space="preserve">talk should operate in practice as to its careful philosophical use. The paper instances what it argues for.</w:t>
       </w:r>
     </w:p>
     <w:p>
@@ -5578,7 +5590,7 @@
         <w:t xml:space="preserve"> </w:t>
       </w:r>
       <w:r>
-        <w:t xml:space="preserve">claim is to have invented a new general methodological move within conceptual engineering. The constrained-conceptual-revision space is already well-developed in the literature surveyed above; what this paper contributes is its application to AI agency specifically, with the structural conditions §2 articulates serving as the application’s distinctive commitment and the compact-form serving as its consequence-side. Within the conceptual-engineering register, the fifth-position move is recognisable rather than novel; what may be novel is its specific shape for the agency-extension question and its grounding in the asymmetric-comprehension argument that the longer companion work develops.</w:t>
+        <w:t xml:space="preserve">claim is to have invented a new general methodological move within conceptual engineering. The constrained-conceptual-revision space is already well-developed in the literature surveyed above; what this paper contributes is its application to AI agency specifically, with the structural conditions §2 articulates serving as the application’s distinctive commitment and the compact-form serving as its consequence-side. Within the conceptual-engineering register, the fifth-position move is recognisable rather than novel; what may be novel is its specific shape for the agency-extension question and its grounding in the asymmetric-comprehension argument (see §2’s expanded warrant for the lineage across five traditions; full formal development in companion work).</w:t>
       </w:r>
     </w:p>
     <w:p>

</xml_diff>